<commit_message>
Populate sample characteristics with demographic data (Table 1)
- Real demographic/usage profile (N=312): gender, age, marital status,
  occupation, income, metaverse engagement frequency, NFT interaction,
  virtual-event participation, social/content creation
- Added two-panel Sample Profile table (Table 1) to narrative md + docx
- Rewrote sample characteristics paragraph with actual figures (all sum to 312)
</commit_message>
<xml_diff>
--- a/Results_BSRS_narrative.docx
+++ b/Results_BSRS_narrative.docx
@@ -32,15 +32,14 @@
       <w:pPr>
         <w:spacing w:after="160"/>
         <w:jc w:val="both"/>
-        <w:shd w:val="clear" w:color="auto" w:fill="FFF2CC"/>
       </w:pPr>
       <w:r>
         <w:rPr>
           <w:rFonts w:ascii="Times New Roman" w:hAnsi="Times New Roman"/>
-          <w:i/>
+          <w:i w:val="0"/>
           <w:sz w:val="24"/>
         </w:rPr>
-        <w:t>Data note (to be populated from your sampling records). The dataset provided (Responses.xlsx) contains only the reflective indicators for the four constructs (UE, UX, BSAT, BSUC) and the two attention-check items; it does not include demographic or platform-usage variables. The descriptive profile below is therefore supplied as a template to be completed from your own sampling records. The bracketed figures must be replaced with the actual sample statistics; they are not derived from the analysed data file and should not be reported until verified.</w:t>
+        <w:t>The final sample comprised 312 complete responses from active users of avatar-mediated (metaverse-type) platforms in India; all 312 cases were retained, as there were no missing values across the 20 items and no straight-line response patterns. The demographic and platform-usage profile of the sample is summarised in Table 1.</w:t>
       </w:r>
     </w:p>
     <w:p>
@@ -54,8 +53,2425 @@
           <w:i w:val="0"/>
           <w:sz w:val="24"/>
         </w:rPr>
-        <w:t>The final sample comprised 312 complete responses from active users of avatar-mediated platforms in India. [The sample was approximately balanced by gender (XX% women, XX% men), spanned young-adult to middle-aged cohorts (XX% aged 18–24, XX% 25–34, XX% 35+), and included students (XX%), salaried employees (XX%), and business professionals (XX%) across varied income bands.] In terms of immersive-platform use, [a majority (XX%) reported engaging with metaverse-type environments at least weekly, with substantial participation in NFT trading (XX%), social interaction and content creation (XX%), and virtual events (XX%)], confirming that respondents possessed meaningful experience with brand-related activities in these environments. All 312 cases were retained: there were no missing values across the 20 items and no straight-line response patterns.</w:t>
+        <w:t>The sample was reasonably balanced by gender, with a slight majority of women (54.00%, n = 169) relative to men (46.00%, n = 143). Respondents were distributed fairly evenly across the five age bands, from 18–22 years (20.51%) and 23–28 years (24.04%) through to 42–45 years (17.95%), indicating that the sample spans younger and more established adult cohorts rather than being concentrated in a single generation. In terms of marital status, the largest groups were married respondents without children (38.78%) and single respondents (34.29%), followed by married respondents with children (26.93%). Occupationally, the sample combined business professionals (39.10%), salaried employees (32.69%), and students (28.21%), and monthly family income was spread across all bands, with the largest group in the INR 50,001–80,000 range (32.05%) and meaningful representation at both lower (≤ INR 30,000: 18.40%) and higher (≥ INR 80,001: 23.91%) ends.</w:t>
       </w:r>
+    </w:p>
+    <w:p>
+      <w:pPr>
+        <w:spacing w:after="160"/>
+        <w:jc w:val="both"/>
+      </w:pPr>
+      <w:r>
+        <w:rPr>
+          <w:rFonts w:ascii="Times New Roman" w:hAnsi="Times New Roman"/>
+          <w:i w:val="0"/>
+          <w:sz w:val="24"/>
+        </w:rPr>
+        <w:t>Crucially for the present study, respondents reported substantial experience with brand-relevant activities in immersive environments. A clear majority engaged with metaverse-type platforms at least weekly (71.46%: daily 16.67%, several times a week 31.41%, weekly 23.38%), and the remainder did so monthly (17.31%) or rarely (11.21%). Beyond mere access, large proportions of respondents had participated in behaviours central to brand experience in these settings: social interaction and content creation (52.56%), NFT interaction (45.19%), and virtual-event participation (41.35%). Together, this profile confirms that the respondents possessed meaningful, behaviourally grounded exposure to brands in avatar-mediated environments, supporting the relevance of the sample to the research questions.</w:t>
+      </w:r>
+    </w:p>
+    <w:p>
+      <w:pPr>
+        <w:spacing w:after="80"/>
+      </w:pPr>
+      <w:r>
+        <w:rPr>
+          <w:rFonts w:ascii="Times New Roman" w:hAnsi="Times New Roman"/>
+          <w:b/>
+          <w:sz w:val="22"/>
+        </w:rPr>
+        <w:t>Table 1. Sample profile (N = 312).</w:t>
+      </w:r>
+    </w:p>
+    <w:tbl>
+      <w:tblPr>
+        <w:tblStyle w:val="TableGrid"/>
+        <w:tblW w:type="auto" w:w="0"/>
+        <w:jc w:val="center"/>
+        <w:tblLook w:firstColumn="1" w:firstRow="1" w:lastColumn="0" w:lastRow="0" w:noHBand="0" w:noVBand="1" w:val="04A0"/>
+      </w:tblPr>
+      <w:tblGrid>
+        <w:gridCol w:w="1440"/>
+        <w:gridCol w:w="1440"/>
+        <w:gridCol w:w="1440"/>
+        <w:gridCol w:w="1440"/>
+        <w:gridCol w:w="1440"/>
+        <w:gridCol w:w="1440"/>
+      </w:tblGrid>
+      <w:tr>
+        <w:tc>
+          <w:tcPr>
+            <w:tcW w:type="dxa" w:w="1440"/>
+            <w:shd w:val="clear" w:color="auto" w:fill="DDDDDD"/>
+          </w:tcPr>
+          <w:p>
+            <w:pPr>
+              <w:spacing w:after="20" w:before="20"/>
+            </w:pPr>
+            <w:r>
+              <w:rPr>
+                <w:rFonts w:ascii="Times New Roman" w:hAnsi="Times New Roman"/>
+                <w:b/>
+                <w:sz w:val="20"/>
+              </w:rPr>
+              <w:t>Participants' information</w:t>
+            </w:r>
+          </w:p>
+        </w:tc>
+        <w:tc>
+          <w:tcPr>
+            <w:tcW w:type="dxa" w:w="1440"/>
+            <w:shd w:val="clear" w:color="auto" w:fill="DDDDDD"/>
+          </w:tcPr>
+          <w:p>
+            <w:pPr>
+              <w:spacing w:after="20" w:before="20"/>
+              <w:jc w:val="center"/>
+            </w:pPr>
+            <w:r>
+              <w:rPr>
+                <w:rFonts w:ascii="Times New Roman" w:hAnsi="Times New Roman"/>
+                <w:b/>
+                <w:sz w:val="20"/>
+              </w:rPr>
+              <w:t>n</w:t>
+            </w:r>
+          </w:p>
+        </w:tc>
+        <w:tc>
+          <w:tcPr>
+            <w:tcW w:type="dxa" w:w="1440"/>
+            <w:shd w:val="clear" w:color="auto" w:fill="DDDDDD"/>
+          </w:tcPr>
+          <w:p>
+            <w:pPr>
+              <w:spacing w:after="20" w:before="20"/>
+              <w:jc w:val="center"/>
+            </w:pPr>
+            <w:r>
+              <w:rPr>
+                <w:rFonts w:ascii="Times New Roman" w:hAnsi="Times New Roman"/>
+                <w:b/>
+                <w:sz w:val="20"/>
+              </w:rPr>
+              <w:t>%</w:t>
+            </w:r>
+          </w:p>
+        </w:tc>
+        <w:tc>
+          <w:tcPr>
+            <w:tcW w:type="dxa" w:w="1440"/>
+            <w:shd w:val="clear" w:color="auto" w:fill="DDDDDD"/>
+          </w:tcPr>
+          <w:p>
+            <w:pPr>
+              <w:spacing w:after="20" w:before="20"/>
+            </w:pPr>
+            <w:r>
+              <w:rPr>
+                <w:rFonts w:ascii="Times New Roman" w:hAnsi="Times New Roman"/>
+                <w:b/>
+                <w:sz w:val="20"/>
+              </w:rPr>
+              <w:t>Participants' information</w:t>
+            </w:r>
+          </w:p>
+        </w:tc>
+        <w:tc>
+          <w:tcPr>
+            <w:tcW w:type="dxa" w:w="1440"/>
+            <w:shd w:val="clear" w:color="auto" w:fill="DDDDDD"/>
+          </w:tcPr>
+          <w:p>
+            <w:pPr>
+              <w:spacing w:after="20" w:before="20"/>
+              <w:jc w:val="center"/>
+            </w:pPr>
+            <w:r>
+              <w:rPr>
+                <w:rFonts w:ascii="Times New Roman" w:hAnsi="Times New Roman"/>
+                <w:b/>
+                <w:sz w:val="20"/>
+              </w:rPr>
+              <w:t>n</w:t>
+            </w:r>
+          </w:p>
+        </w:tc>
+        <w:tc>
+          <w:tcPr>
+            <w:tcW w:type="dxa" w:w="1440"/>
+            <w:shd w:val="clear" w:color="auto" w:fill="DDDDDD"/>
+          </w:tcPr>
+          <w:p>
+            <w:pPr>
+              <w:spacing w:after="20" w:before="20"/>
+              <w:jc w:val="center"/>
+            </w:pPr>
+            <w:r>
+              <w:rPr>
+                <w:rFonts w:ascii="Times New Roman" w:hAnsi="Times New Roman"/>
+                <w:b/>
+                <w:sz w:val="20"/>
+              </w:rPr>
+              <w:t>%</w:t>
+            </w:r>
+          </w:p>
+        </w:tc>
+      </w:tr>
+      <w:tr>
+        <w:tc>
+          <w:tcPr>
+            <w:tcW w:type="dxa" w:w="1440"/>
+          </w:tcPr>
+          <w:p>
+            <w:pPr>
+              <w:spacing w:after="20" w:before="20"/>
+            </w:pPr>
+            <w:r>
+              <w:rPr>
+                <w:rFonts w:ascii="Times New Roman" w:hAnsi="Times New Roman"/>
+                <w:b/>
+                <w:sz w:val="20"/>
+              </w:rPr>
+              <w:t>Gender</w:t>
+            </w:r>
+          </w:p>
+        </w:tc>
+        <w:tc>
+          <w:tcPr>
+            <w:tcW w:type="dxa" w:w="1440"/>
+          </w:tcPr>
+          <w:p>
+            <w:pPr>
+              <w:spacing w:after="20" w:before="20"/>
+              <w:jc w:val="center"/>
+            </w:pPr>
+            <w:r>
+              <w:rPr>
+                <w:rFonts w:ascii="Times New Roman" w:hAnsi="Times New Roman"/>
+                <w:sz w:val="20"/>
+              </w:rPr>
+            </w:r>
+          </w:p>
+        </w:tc>
+        <w:tc>
+          <w:tcPr>
+            <w:tcW w:type="dxa" w:w="1440"/>
+          </w:tcPr>
+          <w:p>
+            <w:pPr>
+              <w:spacing w:after="20" w:before="20"/>
+              <w:jc w:val="center"/>
+            </w:pPr>
+            <w:r>
+              <w:rPr>
+                <w:rFonts w:ascii="Times New Roman" w:hAnsi="Times New Roman"/>
+                <w:sz w:val="20"/>
+              </w:rPr>
+            </w:r>
+          </w:p>
+        </w:tc>
+        <w:tc>
+          <w:tcPr>
+            <w:tcW w:type="dxa" w:w="1440"/>
+          </w:tcPr>
+          <w:p>
+            <w:pPr>
+              <w:spacing w:after="20" w:before="20"/>
+            </w:pPr>
+            <w:r>
+              <w:rPr>
+                <w:rFonts w:ascii="Times New Roman" w:hAnsi="Times New Roman"/>
+                <w:b/>
+                <w:sz w:val="20"/>
+              </w:rPr>
+              <w:t>Metaverse engagement frequency</w:t>
+            </w:r>
+          </w:p>
+        </w:tc>
+        <w:tc>
+          <w:tcPr>
+            <w:tcW w:type="dxa" w:w="1440"/>
+          </w:tcPr>
+          <w:p>
+            <w:pPr>
+              <w:spacing w:after="20" w:before="20"/>
+              <w:jc w:val="center"/>
+            </w:pPr>
+            <w:r>
+              <w:rPr>
+                <w:rFonts w:ascii="Times New Roman" w:hAnsi="Times New Roman"/>
+                <w:sz w:val="20"/>
+              </w:rPr>
+            </w:r>
+          </w:p>
+        </w:tc>
+        <w:tc>
+          <w:tcPr>
+            <w:tcW w:type="dxa" w:w="1440"/>
+          </w:tcPr>
+          <w:p>
+            <w:pPr>
+              <w:spacing w:after="20" w:before="20"/>
+              <w:jc w:val="center"/>
+            </w:pPr>
+            <w:r>
+              <w:rPr>
+                <w:rFonts w:ascii="Times New Roman" w:hAnsi="Times New Roman"/>
+                <w:sz w:val="20"/>
+              </w:rPr>
+            </w:r>
+          </w:p>
+        </w:tc>
+      </w:tr>
+      <w:tr>
+        <w:tc>
+          <w:tcPr>
+            <w:tcW w:type="dxa" w:w="1440"/>
+          </w:tcPr>
+          <w:p>
+            <w:pPr>
+              <w:spacing w:after="20" w:before="20"/>
+            </w:pPr>
+            <w:r>
+              <w:rPr>
+                <w:rFonts w:ascii="Times New Roman" w:hAnsi="Times New Roman"/>
+                <w:sz w:val="20"/>
+              </w:rPr>
+              <w:t>Male</w:t>
+            </w:r>
+          </w:p>
+        </w:tc>
+        <w:tc>
+          <w:tcPr>
+            <w:tcW w:type="dxa" w:w="1440"/>
+          </w:tcPr>
+          <w:p>
+            <w:pPr>
+              <w:spacing w:after="20" w:before="20"/>
+              <w:jc w:val="center"/>
+            </w:pPr>
+            <w:r>
+              <w:rPr>
+                <w:rFonts w:ascii="Times New Roman" w:hAnsi="Times New Roman"/>
+                <w:sz w:val="20"/>
+              </w:rPr>
+              <w:t>143</w:t>
+            </w:r>
+          </w:p>
+        </w:tc>
+        <w:tc>
+          <w:tcPr>
+            <w:tcW w:type="dxa" w:w="1440"/>
+          </w:tcPr>
+          <w:p>
+            <w:pPr>
+              <w:spacing w:after="20" w:before="20"/>
+              <w:jc w:val="center"/>
+            </w:pPr>
+            <w:r>
+              <w:rPr>
+                <w:rFonts w:ascii="Times New Roman" w:hAnsi="Times New Roman"/>
+                <w:sz w:val="20"/>
+              </w:rPr>
+              <w:t>46.00</w:t>
+            </w:r>
+          </w:p>
+        </w:tc>
+        <w:tc>
+          <w:tcPr>
+            <w:tcW w:type="dxa" w:w="1440"/>
+          </w:tcPr>
+          <w:p>
+            <w:pPr>
+              <w:spacing w:after="20" w:before="20"/>
+            </w:pPr>
+            <w:r>
+              <w:rPr>
+                <w:rFonts w:ascii="Times New Roman" w:hAnsi="Times New Roman"/>
+                <w:sz w:val="20"/>
+              </w:rPr>
+              <w:t>Daily</w:t>
+            </w:r>
+          </w:p>
+        </w:tc>
+        <w:tc>
+          <w:tcPr>
+            <w:tcW w:type="dxa" w:w="1440"/>
+          </w:tcPr>
+          <w:p>
+            <w:pPr>
+              <w:spacing w:after="20" w:before="20"/>
+              <w:jc w:val="center"/>
+            </w:pPr>
+            <w:r>
+              <w:rPr>
+                <w:rFonts w:ascii="Times New Roman" w:hAnsi="Times New Roman"/>
+                <w:sz w:val="20"/>
+              </w:rPr>
+              <w:t>52</w:t>
+            </w:r>
+          </w:p>
+        </w:tc>
+        <w:tc>
+          <w:tcPr>
+            <w:tcW w:type="dxa" w:w="1440"/>
+          </w:tcPr>
+          <w:p>
+            <w:pPr>
+              <w:spacing w:after="20" w:before="20"/>
+              <w:jc w:val="center"/>
+            </w:pPr>
+            <w:r>
+              <w:rPr>
+                <w:rFonts w:ascii="Times New Roman" w:hAnsi="Times New Roman"/>
+                <w:sz w:val="20"/>
+              </w:rPr>
+              <w:t>16.67</w:t>
+            </w:r>
+          </w:p>
+        </w:tc>
+      </w:tr>
+      <w:tr>
+        <w:tc>
+          <w:tcPr>
+            <w:tcW w:type="dxa" w:w="1440"/>
+          </w:tcPr>
+          <w:p>
+            <w:pPr>
+              <w:spacing w:after="20" w:before="20"/>
+            </w:pPr>
+            <w:r>
+              <w:rPr>
+                <w:rFonts w:ascii="Times New Roman" w:hAnsi="Times New Roman"/>
+                <w:sz w:val="20"/>
+              </w:rPr>
+              <w:t>Female</w:t>
+            </w:r>
+          </w:p>
+        </w:tc>
+        <w:tc>
+          <w:tcPr>
+            <w:tcW w:type="dxa" w:w="1440"/>
+          </w:tcPr>
+          <w:p>
+            <w:pPr>
+              <w:spacing w:after="20" w:before="20"/>
+              <w:jc w:val="center"/>
+            </w:pPr>
+            <w:r>
+              <w:rPr>
+                <w:rFonts w:ascii="Times New Roman" w:hAnsi="Times New Roman"/>
+                <w:sz w:val="20"/>
+              </w:rPr>
+              <w:t>169</w:t>
+            </w:r>
+          </w:p>
+        </w:tc>
+        <w:tc>
+          <w:tcPr>
+            <w:tcW w:type="dxa" w:w="1440"/>
+          </w:tcPr>
+          <w:p>
+            <w:pPr>
+              <w:spacing w:after="20" w:before="20"/>
+              <w:jc w:val="center"/>
+            </w:pPr>
+            <w:r>
+              <w:rPr>
+                <w:rFonts w:ascii="Times New Roman" w:hAnsi="Times New Roman"/>
+                <w:sz w:val="20"/>
+              </w:rPr>
+              <w:t>54.00</w:t>
+            </w:r>
+          </w:p>
+        </w:tc>
+        <w:tc>
+          <w:tcPr>
+            <w:tcW w:type="dxa" w:w="1440"/>
+          </w:tcPr>
+          <w:p>
+            <w:pPr>
+              <w:spacing w:after="20" w:before="20"/>
+            </w:pPr>
+            <w:r>
+              <w:rPr>
+                <w:rFonts w:ascii="Times New Roman" w:hAnsi="Times New Roman"/>
+                <w:sz w:val="20"/>
+              </w:rPr>
+              <w:t>Several times a week</w:t>
+            </w:r>
+          </w:p>
+        </w:tc>
+        <w:tc>
+          <w:tcPr>
+            <w:tcW w:type="dxa" w:w="1440"/>
+          </w:tcPr>
+          <w:p>
+            <w:pPr>
+              <w:spacing w:after="20" w:before="20"/>
+              <w:jc w:val="center"/>
+            </w:pPr>
+            <w:r>
+              <w:rPr>
+                <w:rFonts w:ascii="Times New Roman" w:hAnsi="Times New Roman"/>
+                <w:sz w:val="20"/>
+              </w:rPr>
+              <w:t>98</w:t>
+            </w:r>
+          </w:p>
+        </w:tc>
+        <w:tc>
+          <w:tcPr>
+            <w:tcW w:type="dxa" w:w="1440"/>
+          </w:tcPr>
+          <w:p>
+            <w:pPr>
+              <w:spacing w:after="20" w:before="20"/>
+              <w:jc w:val="center"/>
+            </w:pPr>
+            <w:r>
+              <w:rPr>
+                <w:rFonts w:ascii="Times New Roman" w:hAnsi="Times New Roman"/>
+                <w:sz w:val="20"/>
+              </w:rPr>
+              <w:t>31.41</w:t>
+            </w:r>
+          </w:p>
+        </w:tc>
+      </w:tr>
+      <w:tr>
+        <w:tc>
+          <w:tcPr>
+            <w:tcW w:type="dxa" w:w="1440"/>
+          </w:tcPr>
+          <w:p>
+            <w:pPr>
+              <w:spacing w:after="20" w:before="20"/>
+            </w:pPr>
+            <w:r>
+              <w:rPr>
+                <w:rFonts w:ascii="Times New Roman" w:hAnsi="Times New Roman"/>
+                <w:sz w:val="20"/>
+              </w:rPr>
+            </w:r>
+          </w:p>
+        </w:tc>
+        <w:tc>
+          <w:tcPr>
+            <w:tcW w:type="dxa" w:w="1440"/>
+          </w:tcPr>
+          <w:p>
+            <w:pPr>
+              <w:spacing w:after="20" w:before="20"/>
+              <w:jc w:val="center"/>
+            </w:pPr>
+            <w:r>
+              <w:rPr>
+                <w:rFonts w:ascii="Times New Roman" w:hAnsi="Times New Roman"/>
+                <w:sz w:val="20"/>
+              </w:rPr>
+            </w:r>
+          </w:p>
+        </w:tc>
+        <w:tc>
+          <w:tcPr>
+            <w:tcW w:type="dxa" w:w="1440"/>
+          </w:tcPr>
+          <w:p>
+            <w:pPr>
+              <w:spacing w:after="20" w:before="20"/>
+              <w:jc w:val="center"/>
+            </w:pPr>
+            <w:r>
+              <w:rPr>
+                <w:rFonts w:ascii="Times New Roman" w:hAnsi="Times New Roman"/>
+                <w:sz w:val="20"/>
+              </w:rPr>
+            </w:r>
+          </w:p>
+        </w:tc>
+        <w:tc>
+          <w:tcPr>
+            <w:tcW w:type="dxa" w:w="1440"/>
+          </w:tcPr>
+          <w:p>
+            <w:pPr>
+              <w:spacing w:after="20" w:before="20"/>
+            </w:pPr>
+            <w:r>
+              <w:rPr>
+                <w:rFonts w:ascii="Times New Roman" w:hAnsi="Times New Roman"/>
+                <w:sz w:val="20"/>
+              </w:rPr>
+              <w:t>Weekly</w:t>
+            </w:r>
+          </w:p>
+        </w:tc>
+        <w:tc>
+          <w:tcPr>
+            <w:tcW w:type="dxa" w:w="1440"/>
+          </w:tcPr>
+          <w:p>
+            <w:pPr>
+              <w:spacing w:after="20" w:before="20"/>
+              <w:jc w:val="center"/>
+            </w:pPr>
+            <w:r>
+              <w:rPr>
+                <w:rFonts w:ascii="Times New Roman" w:hAnsi="Times New Roman"/>
+                <w:sz w:val="20"/>
+              </w:rPr>
+              <w:t>73</w:t>
+            </w:r>
+          </w:p>
+        </w:tc>
+        <w:tc>
+          <w:tcPr>
+            <w:tcW w:type="dxa" w:w="1440"/>
+          </w:tcPr>
+          <w:p>
+            <w:pPr>
+              <w:spacing w:after="20" w:before="20"/>
+              <w:jc w:val="center"/>
+            </w:pPr>
+            <w:r>
+              <w:rPr>
+                <w:rFonts w:ascii="Times New Roman" w:hAnsi="Times New Roman"/>
+                <w:sz w:val="20"/>
+              </w:rPr>
+              <w:t>23.38</w:t>
+            </w:r>
+          </w:p>
+        </w:tc>
+      </w:tr>
+      <w:tr>
+        <w:tc>
+          <w:tcPr>
+            <w:tcW w:type="dxa" w:w="1440"/>
+          </w:tcPr>
+          <w:p>
+            <w:pPr>
+              <w:spacing w:after="20" w:before="20"/>
+            </w:pPr>
+            <w:r>
+              <w:rPr>
+                <w:rFonts w:ascii="Times New Roman" w:hAnsi="Times New Roman"/>
+                <w:b/>
+                <w:sz w:val="20"/>
+              </w:rPr>
+              <w:t>Age (years)</w:t>
+            </w:r>
+          </w:p>
+        </w:tc>
+        <w:tc>
+          <w:tcPr>
+            <w:tcW w:type="dxa" w:w="1440"/>
+          </w:tcPr>
+          <w:p>
+            <w:pPr>
+              <w:spacing w:after="20" w:before="20"/>
+              <w:jc w:val="center"/>
+            </w:pPr>
+            <w:r>
+              <w:rPr>
+                <w:rFonts w:ascii="Times New Roman" w:hAnsi="Times New Roman"/>
+                <w:sz w:val="20"/>
+              </w:rPr>
+            </w:r>
+          </w:p>
+        </w:tc>
+        <w:tc>
+          <w:tcPr>
+            <w:tcW w:type="dxa" w:w="1440"/>
+          </w:tcPr>
+          <w:p>
+            <w:pPr>
+              <w:spacing w:after="20" w:before="20"/>
+              <w:jc w:val="center"/>
+            </w:pPr>
+            <w:r>
+              <w:rPr>
+                <w:rFonts w:ascii="Times New Roman" w:hAnsi="Times New Roman"/>
+                <w:sz w:val="20"/>
+              </w:rPr>
+            </w:r>
+          </w:p>
+        </w:tc>
+        <w:tc>
+          <w:tcPr>
+            <w:tcW w:type="dxa" w:w="1440"/>
+          </w:tcPr>
+          <w:p>
+            <w:pPr>
+              <w:spacing w:after="20" w:before="20"/>
+            </w:pPr>
+            <w:r>
+              <w:rPr>
+                <w:rFonts w:ascii="Times New Roman" w:hAnsi="Times New Roman"/>
+                <w:b/>
+                <w:sz w:val="20"/>
+              </w:rPr>
+              <w:t>Monthly</w:t>
+            </w:r>
+          </w:p>
+        </w:tc>
+        <w:tc>
+          <w:tcPr>
+            <w:tcW w:type="dxa" w:w="1440"/>
+          </w:tcPr>
+          <w:p>
+            <w:pPr>
+              <w:spacing w:after="20" w:before="20"/>
+              <w:jc w:val="center"/>
+            </w:pPr>
+            <w:r>
+              <w:rPr>
+                <w:rFonts w:ascii="Times New Roman" w:hAnsi="Times New Roman"/>
+                <w:sz w:val="20"/>
+              </w:rPr>
+              <w:t>54</w:t>
+            </w:r>
+          </w:p>
+        </w:tc>
+        <w:tc>
+          <w:tcPr>
+            <w:tcW w:type="dxa" w:w="1440"/>
+          </w:tcPr>
+          <w:p>
+            <w:pPr>
+              <w:spacing w:after="20" w:before="20"/>
+              <w:jc w:val="center"/>
+            </w:pPr>
+            <w:r>
+              <w:rPr>
+                <w:rFonts w:ascii="Times New Roman" w:hAnsi="Times New Roman"/>
+                <w:sz w:val="20"/>
+              </w:rPr>
+              <w:t>17.31</w:t>
+            </w:r>
+          </w:p>
+        </w:tc>
+      </w:tr>
+      <w:tr>
+        <w:tc>
+          <w:tcPr>
+            <w:tcW w:type="dxa" w:w="1440"/>
+          </w:tcPr>
+          <w:p>
+            <w:pPr>
+              <w:spacing w:after="20" w:before="20"/>
+            </w:pPr>
+            <w:r>
+              <w:rPr>
+                <w:rFonts w:ascii="Times New Roman" w:hAnsi="Times New Roman"/>
+                <w:sz w:val="20"/>
+              </w:rPr>
+              <w:t>18–22</w:t>
+            </w:r>
+          </w:p>
+        </w:tc>
+        <w:tc>
+          <w:tcPr>
+            <w:tcW w:type="dxa" w:w="1440"/>
+          </w:tcPr>
+          <w:p>
+            <w:pPr>
+              <w:spacing w:after="20" w:before="20"/>
+              <w:jc w:val="center"/>
+            </w:pPr>
+            <w:r>
+              <w:rPr>
+                <w:rFonts w:ascii="Times New Roman" w:hAnsi="Times New Roman"/>
+                <w:sz w:val="20"/>
+              </w:rPr>
+              <w:t>64</w:t>
+            </w:r>
+          </w:p>
+        </w:tc>
+        <w:tc>
+          <w:tcPr>
+            <w:tcW w:type="dxa" w:w="1440"/>
+          </w:tcPr>
+          <w:p>
+            <w:pPr>
+              <w:spacing w:after="20" w:before="20"/>
+              <w:jc w:val="center"/>
+            </w:pPr>
+            <w:r>
+              <w:rPr>
+                <w:rFonts w:ascii="Times New Roman" w:hAnsi="Times New Roman"/>
+                <w:sz w:val="20"/>
+              </w:rPr>
+              <w:t>20.51</w:t>
+            </w:r>
+          </w:p>
+        </w:tc>
+        <w:tc>
+          <w:tcPr>
+            <w:tcW w:type="dxa" w:w="1440"/>
+          </w:tcPr>
+          <w:p>
+            <w:pPr>
+              <w:spacing w:after="20" w:before="20"/>
+            </w:pPr>
+            <w:r>
+              <w:rPr>
+                <w:rFonts w:ascii="Times New Roman" w:hAnsi="Times New Roman"/>
+                <w:sz w:val="20"/>
+              </w:rPr>
+              <w:t>Rarely</w:t>
+            </w:r>
+          </w:p>
+        </w:tc>
+        <w:tc>
+          <w:tcPr>
+            <w:tcW w:type="dxa" w:w="1440"/>
+          </w:tcPr>
+          <w:p>
+            <w:pPr>
+              <w:spacing w:after="20" w:before="20"/>
+              <w:jc w:val="center"/>
+            </w:pPr>
+            <w:r>
+              <w:rPr>
+                <w:rFonts w:ascii="Times New Roman" w:hAnsi="Times New Roman"/>
+                <w:sz w:val="20"/>
+              </w:rPr>
+              <w:t>35</w:t>
+            </w:r>
+          </w:p>
+        </w:tc>
+        <w:tc>
+          <w:tcPr>
+            <w:tcW w:type="dxa" w:w="1440"/>
+          </w:tcPr>
+          <w:p>
+            <w:pPr>
+              <w:spacing w:after="20" w:before="20"/>
+              <w:jc w:val="center"/>
+            </w:pPr>
+            <w:r>
+              <w:rPr>
+                <w:rFonts w:ascii="Times New Roman" w:hAnsi="Times New Roman"/>
+                <w:sz w:val="20"/>
+              </w:rPr>
+              <w:t>11.21</w:t>
+            </w:r>
+          </w:p>
+        </w:tc>
+      </w:tr>
+      <w:tr>
+        <w:tc>
+          <w:tcPr>
+            <w:tcW w:type="dxa" w:w="1440"/>
+          </w:tcPr>
+          <w:p>
+            <w:pPr>
+              <w:spacing w:after="20" w:before="20"/>
+            </w:pPr>
+            <w:r>
+              <w:rPr>
+                <w:rFonts w:ascii="Times New Roman" w:hAnsi="Times New Roman"/>
+                <w:sz w:val="20"/>
+              </w:rPr>
+              <w:t>23–28</w:t>
+            </w:r>
+          </w:p>
+        </w:tc>
+        <w:tc>
+          <w:tcPr>
+            <w:tcW w:type="dxa" w:w="1440"/>
+          </w:tcPr>
+          <w:p>
+            <w:pPr>
+              <w:spacing w:after="20" w:before="20"/>
+              <w:jc w:val="center"/>
+            </w:pPr>
+            <w:r>
+              <w:rPr>
+                <w:rFonts w:ascii="Times New Roman" w:hAnsi="Times New Roman"/>
+                <w:sz w:val="20"/>
+              </w:rPr>
+              <w:t>75</w:t>
+            </w:r>
+          </w:p>
+        </w:tc>
+        <w:tc>
+          <w:tcPr>
+            <w:tcW w:type="dxa" w:w="1440"/>
+          </w:tcPr>
+          <w:p>
+            <w:pPr>
+              <w:spacing w:after="20" w:before="20"/>
+              <w:jc w:val="center"/>
+            </w:pPr>
+            <w:r>
+              <w:rPr>
+                <w:rFonts w:ascii="Times New Roman" w:hAnsi="Times New Roman"/>
+                <w:sz w:val="20"/>
+              </w:rPr>
+              <w:t>24.04</w:t>
+            </w:r>
+          </w:p>
+        </w:tc>
+        <w:tc>
+          <w:tcPr>
+            <w:tcW w:type="dxa" w:w="1440"/>
+          </w:tcPr>
+          <w:p>
+            <w:pPr>
+              <w:spacing w:after="20" w:before="20"/>
+            </w:pPr>
+            <w:r>
+              <w:rPr>
+                <w:rFonts w:ascii="Times New Roman" w:hAnsi="Times New Roman"/>
+                <w:sz w:val="20"/>
+              </w:rPr>
+            </w:r>
+          </w:p>
+        </w:tc>
+        <w:tc>
+          <w:tcPr>
+            <w:tcW w:type="dxa" w:w="1440"/>
+          </w:tcPr>
+          <w:p>
+            <w:pPr>
+              <w:spacing w:after="20" w:before="20"/>
+              <w:jc w:val="center"/>
+            </w:pPr>
+            <w:r>
+              <w:rPr>
+                <w:rFonts w:ascii="Times New Roman" w:hAnsi="Times New Roman"/>
+                <w:sz w:val="20"/>
+              </w:rPr>
+            </w:r>
+          </w:p>
+        </w:tc>
+        <w:tc>
+          <w:tcPr>
+            <w:tcW w:type="dxa" w:w="1440"/>
+          </w:tcPr>
+          <w:p>
+            <w:pPr>
+              <w:spacing w:after="20" w:before="20"/>
+              <w:jc w:val="center"/>
+            </w:pPr>
+            <w:r>
+              <w:rPr>
+                <w:rFonts w:ascii="Times New Roman" w:hAnsi="Times New Roman"/>
+                <w:sz w:val="20"/>
+              </w:rPr>
+            </w:r>
+          </w:p>
+        </w:tc>
+      </w:tr>
+      <w:tr>
+        <w:tc>
+          <w:tcPr>
+            <w:tcW w:type="dxa" w:w="1440"/>
+          </w:tcPr>
+          <w:p>
+            <w:pPr>
+              <w:spacing w:after="20" w:before="20"/>
+            </w:pPr>
+            <w:r>
+              <w:rPr>
+                <w:rFonts w:ascii="Times New Roman" w:hAnsi="Times New Roman"/>
+                <w:b/>
+                <w:sz w:val="20"/>
+              </w:rPr>
+              <w:t>29–34</w:t>
+            </w:r>
+          </w:p>
+        </w:tc>
+        <w:tc>
+          <w:tcPr>
+            <w:tcW w:type="dxa" w:w="1440"/>
+          </w:tcPr>
+          <w:p>
+            <w:pPr>
+              <w:spacing w:after="20" w:before="20"/>
+              <w:jc w:val="center"/>
+            </w:pPr>
+            <w:r>
+              <w:rPr>
+                <w:rFonts w:ascii="Times New Roman" w:hAnsi="Times New Roman"/>
+                <w:sz w:val="20"/>
+              </w:rPr>
+              <w:t>60</w:t>
+            </w:r>
+          </w:p>
+        </w:tc>
+        <w:tc>
+          <w:tcPr>
+            <w:tcW w:type="dxa" w:w="1440"/>
+          </w:tcPr>
+          <w:p>
+            <w:pPr>
+              <w:spacing w:after="20" w:before="20"/>
+              <w:jc w:val="center"/>
+            </w:pPr>
+            <w:r>
+              <w:rPr>
+                <w:rFonts w:ascii="Times New Roman" w:hAnsi="Times New Roman"/>
+                <w:sz w:val="20"/>
+              </w:rPr>
+              <w:t>19.23</w:t>
+            </w:r>
+          </w:p>
+        </w:tc>
+        <w:tc>
+          <w:tcPr>
+            <w:tcW w:type="dxa" w:w="1440"/>
+          </w:tcPr>
+          <w:p>
+            <w:pPr>
+              <w:spacing w:after="20" w:before="20"/>
+            </w:pPr>
+            <w:r>
+              <w:rPr>
+                <w:rFonts w:ascii="Times New Roman" w:hAnsi="Times New Roman"/>
+                <w:b/>
+                <w:sz w:val="20"/>
+              </w:rPr>
+              <w:t>NFT interaction</w:t>
+            </w:r>
+          </w:p>
+        </w:tc>
+        <w:tc>
+          <w:tcPr>
+            <w:tcW w:type="dxa" w:w="1440"/>
+          </w:tcPr>
+          <w:p>
+            <w:pPr>
+              <w:spacing w:after="20" w:before="20"/>
+              <w:jc w:val="center"/>
+            </w:pPr>
+            <w:r>
+              <w:rPr>
+                <w:rFonts w:ascii="Times New Roman" w:hAnsi="Times New Roman"/>
+                <w:sz w:val="20"/>
+              </w:rPr>
+            </w:r>
+          </w:p>
+        </w:tc>
+        <w:tc>
+          <w:tcPr>
+            <w:tcW w:type="dxa" w:w="1440"/>
+          </w:tcPr>
+          <w:p>
+            <w:pPr>
+              <w:spacing w:after="20" w:before="20"/>
+              <w:jc w:val="center"/>
+            </w:pPr>
+            <w:r>
+              <w:rPr>
+                <w:rFonts w:ascii="Times New Roman" w:hAnsi="Times New Roman"/>
+                <w:sz w:val="20"/>
+              </w:rPr>
+            </w:r>
+          </w:p>
+        </w:tc>
+      </w:tr>
+      <w:tr>
+        <w:tc>
+          <w:tcPr>
+            <w:tcW w:type="dxa" w:w="1440"/>
+          </w:tcPr>
+          <w:p>
+            <w:pPr>
+              <w:spacing w:after="20" w:before="20"/>
+            </w:pPr>
+            <w:r>
+              <w:rPr>
+                <w:rFonts w:ascii="Times New Roman" w:hAnsi="Times New Roman"/>
+                <w:sz w:val="20"/>
+              </w:rPr>
+              <w:t>35–41</w:t>
+            </w:r>
+          </w:p>
+        </w:tc>
+        <w:tc>
+          <w:tcPr>
+            <w:tcW w:type="dxa" w:w="1440"/>
+          </w:tcPr>
+          <w:p>
+            <w:pPr>
+              <w:spacing w:after="20" w:before="20"/>
+              <w:jc w:val="center"/>
+            </w:pPr>
+            <w:r>
+              <w:rPr>
+                <w:rFonts w:ascii="Times New Roman" w:hAnsi="Times New Roman"/>
+                <w:sz w:val="20"/>
+              </w:rPr>
+              <w:t>57</w:t>
+            </w:r>
+          </w:p>
+        </w:tc>
+        <w:tc>
+          <w:tcPr>
+            <w:tcW w:type="dxa" w:w="1440"/>
+          </w:tcPr>
+          <w:p>
+            <w:pPr>
+              <w:spacing w:after="20" w:before="20"/>
+              <w:jc w:val="center"/>
+            </w:pPr>
+            <w:r>
+              <w:rPr>
+                <w:rFonts w:ascii="Times New Roman" w:hAnsi="Times New Roman"/>
+                <w:sz w:val="20"/>
+              </w:rPr>
+              <w:t>18.27</w:t>
+            </w:r>
+          </w:p>
+        </w:tc>
+        <w:tc>
+          <w:tcPr>
+            <w:tcW w:type="dxa" w:w="1440"/>
+          </w:tcPr>
+          <w:p>
+            <w:pPr>
+              <w:spacing w:after="20" w:before="20"/>
+            </w:pPr>
+            <w:r>
+              <w:rPr>
+                <w:rFonts w:ascii="Times New Roman" w:hAnsi="Times New Roman"/>
+                <w:sz w:val="20"/>
+              </w:rPr>
+              <w:t>Yes</w:t>
+            </w:r>
+          </w:p>
+        </w:tc>
+        <w:tc>
+          <w:tcPr>
+            <w:tcW w:type="dxa" w:w="1440"/>
+          </w:tcPr>
+          <w:p>
+            <w:pPr>
+              <w:spacing w:after="20" w:before="20"/>
+              <w:jc w:val="center"/>
+            </w:pPr>
+            <w:r>
+              <w:rPr>
+                <w:rFonts w:ascii="Times New Roman" w:hAnsi="Times New Roman"/>
+                <w:sz w:val="20"/>
+              </w:rPr>
+              <w:t>141</w:t>
+            </w:r>
+          </w:p>
+        </w:tc>
+        <w:tc>
+          <w:tcPr>
+            <w:tcW w:type="dxa" w:w="1440"/>
+          </w:tcPr>
+          <w:p>
+            <w:pPr>
+              <w:spacing w:after="20" w:before="20"/>
+              <w:jc w:val="center"/>
+            </w:pPr>
+            <w:r>
+              <w:rPr>
+                <w:rFonts w:ascii="Times New Roman" w:hAnsi="Times New Roman"/>
+                <w:sz w:val="20"/>
+              </w:rPr>
+              <w:t>45.19</w:t>
+            </w:r>
+          </w:p>
+        </w:tc>
+      </w:tr>
+      <w:tr>
+        <w:tc>
+          <w:tcPr>
+            <w:tcW w:type="dxa" w:w="1440"/>
+          </w:tcPr>
+          <w:p>
+            <w:pPr>
+              <w:spacing w:after="20" w:before="20"/>
+            </w:pPr>
+            <w:r>
+              <w:rPr>
+                <w:rFonts w:ascii="Times New Roman" w:hAnsi="Times New Roman"/>
+                <w:sz w:val="20"/>
+              </w:rPr>
+              <w:t>42–45</w:t>
+            </w:r>
+          </w:p>
+        </w:tc>
+        <w:tc>
+          <w:tcPr>
+            <w:tcW w:type="dxa" w:w="1440"/>
+          </w:tcPr>
+          <w:p>
+            <w:pPr>
+              <w:spacing w:after="20" w:before="20"/>
+              <w:jc w:val="center"/>
+            </w:pPr>
+            <w:r>
+              <w:rPr>
+                <w:rFonts w:ascii="Times New Roman" w:hAnsi="Times New Roman"/>
+                <w:sz w:val="20"/>
+              </w:rPr>
+              <w:t>56</w:t>
+            </w:r>
+          </w:p>
+        </w:tc>
+        <w:tc>
+          <w:tcPr>
+            <w:tcW w:type="dxa" w:w="1440"/>
+          </w:tcPr>
+          <w:p>
+            <w:pPr>
+              <w:spacing w:after="20" w:before="20"/>
+              <w:jc w:val="center"/>
+            </w:pPr>
+            <w:r>
+              <w:rPr>
+                <w:rFonts w:ascii="Times New Roman" w:hAnsi="Times New Roman"/>
+                <w:sz w:val="20"/>
+              </w:rPr>
+              <w:t>17.95</w:t>
+            </w:r>
+          </w:p>
+        </w:tc>
+        <w:tc>
+          <w:tcPr>
+            <w:tcW w:type="dxa" w:w="1440"/>
+          </w:tcPr>
+          <w:p>
+            <w:pPr>
+              <w:spacing w:after="20" w:before="20"/>
+            </w:pPr>
+            <w:r>
+              <w:rPr>
+                <w:rFonts w:ascii="Times New Roman" w:hAnsi="Times New Roman"/>
+                <w:sz w:val="20"/>
+              </w:rPr>
+              <w:t>No</w:t>
+            </w:r>
+          </w:p>
+        </w:tc>
+        <w:tc>
+          <w:tcPr>
+            <w:tcW w:type="dxa" w:w="1440"/>
+          </w:tcPr>
+          <w:p>
+            <w:pPr>
+              <w:spacing w:after="20" w:before="20"/>
+              <w:jc w:val="center"/>
+            </w:pPr>
+            <w:r>
+              <w:rPr>
+                <w:rFonts w:ascii="Times New Roman" w:hAnsi="Times New Roman"/>
+                <w:sz w:val="20"/>
+              </w:rPr>
+              <w:t>171</w:t>
+            </w:r>
+          </w:p>
+        </w:tc>
+        <w:tc>
+          <w:tcPr>
+            <w:tcW w:type="dxa" w:w="1440"/>
+          </w:tcPr>
+          <w:p>
+            <w:pPr>
+              <w:spacing w:after="20" w:before="20"/>
+              <w:jc w:val="center"/>
+            </w:pPr>
+            <w:r>
+              <w:rPr>
+                <w:rFonts w:ascii="Times New Roman" w:hAnsi="Times New Roman"/>
+                <w:sz w:val="20"/>
+              </w:rPr>
+              <w:t>54.81</w:t>
+            </w:r>
+          </w:p>
+        </w:tc>
+      </w:tr>
+      <w:tr>
+        <w:tc>
+          <w:tcPr>
+            <w:tcW w:type="dxa" w:w="1440"/>
+          </w:tcPr>
+          <w:p>
+            <w:pPr>
+              <w:spacing w:after="20" w:before="20"/>
+            </w:pPr>
+            <w:r>
+              <w:rPr>
+                <w:rFonts w:ascii="Times New Roman" w:hAnsi="Times New Roman"/>
+                <w:b/>
+                <w:sz w:val="20"/>
+              </w:rPr>
+              <w:t>Marital status</w:t>
+            </w:r>
+          </w:p>
+        </w:tc>
+        <w:tc>
+          <w:tcPr>
+            <w:tcW w:type="dxa" w:w="1440"/>
+          </w:tcPr>
+          <w:p>
+            <w:pPr>
+              <w:spacing w:after="20" w:before="20"/>
+              <w:jc w:val="center"/>
+            </w:pPr>
+            <w:r>
+              <w:rPr>
+                <w:rFonts w:ascii="Times New Roman" w:hAnsi="Times New Roman"/>
+                <w:sz w:val="20"/>
+              </w:rPr>
+            </w:r>
+          </w:p>
+        </w:tc>
+        <w:tc>
+          <w:tcPr>
+            <w:tcW w:type="dxa" w:w="1440"/>
+          </w:tcPr>
+          <w:p>
+            <w:pPr>
+              <w:spacing w:after="20" w:before="20"/>
+              <w:jc w:val="center"/>
+            </w:pPr>
+            <w:r>
+              <w:rPr>
+                <w:rFonts w:ascii="Times New Roman" w:hAnsi="Times New Roman"/>
+                <w:sz w:val="20"/>
+              </w:rPr>
+            </w:r>
+          </w:p>
+        </w:tc>
+        <w:tc>
+          <w:tcPr>
+            <w:tcW w:type="dxa" w:w="1440"/>
+          </w:tcPr>
+          <w:p>
+            <w:pPr>
+              <w:spacing w:after="20" w:before="20"/>
+            </w:pPr>
+            <w:r>
+              <w:rPr>
+                <w:rFonts w:ascii="Times New Roman" w:hAnsi="Times New Roman"/>
+                <w:b/>
+                <w:sz w:val="20"/>
+              </w:rPr>
+              <w:t>Virtual event participation</w:t>
+            </w:r>
+          </w:p>
+        </w:tc>
+        <w:tc>
+          <w:tcPr>
+            <w:tcW w:type="dxa" w:w="1440"/>
+          </w:tcPr>
+          <w:p>
+            <w:pPr>
+              <w:spacing w:after="20" w:before="20"/>
+              <w:jc w:val="center"/>
+            </w:pPr>
+            <w:r>
+              <w:rPr>
+                <w:rFonts w:ascii="Times New Roman" w:hAnsi="Times New Roman"/>
+                <w:sz w:val="20"/>
+              </w:rPr>
+            </w:r>
+          </w:p>
+        </w:tc>
+        <w:tc>
+          <w:tcPr>
+            <w:tcW w:type="dxa" w:w="1440"/>
+          </w:tcPr>
+          <w:p>
+            <w:pPr>
+              <w:spacing w:after="20" w:before="20"/>
+              <w:jc w:val="center"/>
+            </w:pPr>
+            <w:r>
+              <w:rPr>
+                <w:rFonts w:ascii="Times New Roman" w:hAnsi="Times New Roman"/>
+                <w:sz w:val="20"/>
+              </w:rPr>
+            </w:r>
+          </w:p>
+        </w:tc>
+      </w:tr>
+      <w:tr>
+        <w:tc>
+          <w:tcPr>
+            <w:tcW w:type="dxa" w:w="1440"/>
+          </w:tcPr>
+          <w:p>
+            <w:pPr>
+              <w:spacing w:after="20" w:before="20"/>
+            </w:pPr>
+            <w:r>
+              <w:rPr>
+                <w:rFonts w:ascii="Times New Roman" w:hAnsi="Times New Roman"/>
+                <w:sz w:val="20"/>
+              </w:rPr>
+              <w:t>Single</w:t>
+            </w:r>
+          </w:p>
+        </w:tc>
+        <w:tc>
+          <w:tcPr>
+            <w:tcW w:type="dxa" w:w="1440"/>
+          </w:tcPr>
+          <w:p>
+            <w:pPr>
+              <w:spacing w:after="20" w:before="20"/>
+              <w:jc w:val="center"/>
+            </w:pPr>
+            <w:r>
+              <w:rPr>
+                <w:rFonts w:ascii="Times New Roman" w:hAnsi="Times New Roman"/>
+                <w:sz w:val="20"/>
+              </w:rPr>
+              <w:t>107</w:t>
+            </w:r>
+          </w:p>
+        </w:tc>
+        <w:tc>
+          <w:tcPr>
+            <w:tcW w:type="dxa" w:w="1440"/>
+          </w:tcPr>
+          <w:p>
+            <w:pPr>
+              <w:spacing w:after="20" w:before="20"/>
+              <w:jc w:val="center"/>
+            </w:pPr>
+            <w:r>
+              <w:rPr>
+                <w:rFonts w:ascii="Times New Roman" w:hAnsi="Times New Roman"/>
+                <w:sz w:val="20"/>
+              </w:rPr>
+              <w:t>34.29</w:t>
+            </w:r>
+          </w:p>
+        </w:tc>
+        <w:tc>
+          <w:tcPr>
+            <w:tcW w:type="dxa" w:w="1440"/>
+          </w:tcPr>
+          <w:p>
+            <w:pPr>
+              <w:spacing w:after="20" w:before="20"/>
+            </w:pPr>
+            <w:r>
+              <w:rPr>
+                <w:rFonts w:ascii="Times New Roman" w:hAnsi="Times New Roman"/>
+                <w:sz w:val="20"/>
+              </w:rPr>
+              <w:t>Yes</w:t>
+            </w:r>
+          </w:p>
+        </w:tc>
+        <w:tc>
+          <w:tcPr>
+            <w:tcW w:type="dxa" w:w="1440"/>
+          </w:tcPr>
+          <w:p>
+            <w:pPr>
+              <w:spacing w:after="20" w:before="20"/>
+              <w:jc w:val="center"/>
+            </w:pPr>
+            <w:r>
+              <w:rPr>
+                <w:rFonts w:ascii="Times New Roman" w:hAnsi="Times New Roman"/>
+                <w:sz w:val="20"/>
+              </w:rPr>
+              <w:t>129</w:t>
+            </w:r>
+          </w:p>
+        </w:tc>
+        <w:tc>
+          <w:tcPr>
+            <w:tcW w:type="dxa" w:w="1440"/>
+          </w:tcPr>
+          <w:p>
+            <w:pPr>
+              <w:spacing w:after="20" w:before="20"/>
+              <w:jc w:val="center"/>
+            </w:pPr>
+            <w:r>
+              <w:rPr>
+                <w:rFonts w:ascii="Times New Roman" w:hAnsi="Times New Roman"/>
+                <w:sz w:val="20"/>
+              </w:rPr>
+              <w:t>41.35</w:t>
+            </w:r>
+          </w:p>
+        </w:tc>
+      </w:tr>
+      <w:tr>
+        <w:tc>
+          <w:tcPr>
+            <w:tcW w:type="dxa" w:w="1440"/>
+          </w:tcPr>
+          <w:p>
+            <w:pPr>
+              <w:spacing w:after="20" w:before="20"/>
+            </w:pPr>
+            <w:r>
+              <w:rPr>
+                <w:rFonts w:ascii="Times New Roman" w:hAnsi="Times New Roman"/>
+                <w:sz w:val="20"/>
+              </w:rPr>
+              <w:t>Married with children</w:t>
+            </w:r>
+          </w:p>
+        </w:tc>
+        <w:tc>
+          <w:tcPr>
+            <w:tcW w:type="dxa" w:w="1440"/>
+          </w:tcPr>
+          <w:p>
+            <w:pPr>
+              <w:spacing w:after="20" w:before="20"/>
+              <w:jc w:val="center"/>
+            </w:pPr>
+            <w:r>
+              <w:rPr>
+                <w:rFonts w:ascii="Times New Roman" w:hAnsi="Times New Roman"/>
+                <w:sz w:val="20"/>
+              </w:rPr>
+              <w:t>84</w:t>
+            </w:r>
+          </w:p>
+        </w:tc>
+        <w:tc>
+          <w:tcPr>
+            <w:tcW w:type="dxa" w:w="1440"/>
+          </w:tcPr>
+          <w:p>
+            <w:pPr>
+              <w:spacing w:after="20" w:before="20"/>
+              <w:jc w:val="center"/>
+            </w:pPr>
+            <w:r>
+              <w:rPr>
+                <w:rFonts w:ascii="Times New Roman" w:hAnsi="Times New Roman"/>
+                <w:sz w:val="20"/>
+              </w:rPr>
+              <w:t>26.93</w:t>
+            </w:r>
+          </w:p>
+        </w:tc>
+        <w:tc>
+          <w:tcPr>
+            <w:tcW w:type="dxa" w:w="1440"/>
+          </w:tcPr>
+          <w:p>
+            <w:pPr>
+              <w:spacing w:after="20" w:before="20"/>
+            </w:pPr>
+            <w:r>
+              <w:rPr>
+                <w:rFonts w:ascii="Times New Roman" w:hAnsi="Times New Roman"/>
+                <w:sz w:val="20"/>
+              </w:rPr>
+              <w:t>No</w:t>
+            </w:r>
+          </w:p>
+        </w:tc>
+        <w:tc>
+          <w:tcPr>
+            <w:tcW w:type="dxa" w:w="1440"/>
+          </w:tcPr>
+          <w:p>
+            <w:pPr>
+              <w:spacing w:after="20" w:before="20"/>
+              <w:jc w:val="center"/>
+            </w:pPr>
+            <w:r>
+              <w:rPr>
+                <w:rFonts w:ascii="Times New Roman" w:hAnsi="Times New Roman"/>
+                <w:sz w:val="20"/>
+              </w:rPr>
+              <w:t>183</w:t>
+            </w:r>
+          </w:p>
+        </w:tc>
+        <w:tc>
+          <w:tcPr>
+            <w:tcW w:type="dxa" w:w="1440"/>
+          </w:tcPr>
+          <w:p>
+            <w:pPr>
+              <w:spacing w:after="20" w:before="20"/>
+              <w:jc w:val="center"/>
+            </w:pPr>
+            <w:r>
+              <w:rPr>
+                <w:rFonts w:ascii="Times New Roman" w:hAnsi="Times New Roman"/>
+                <w:sz w:val="20"/>
+              </w:rPr>
+              <w:t>58.65</w:t>
+            </w:r>
+          </w:p>
+        </w:tc>
+      </w:tr>
+      <w:tr>
+        <w:tc>
+          <w:tcPr>
+            <w:tcW w:type="dxa" w:w="1440"/>
+          </w:tcPr>
+          <w:p>
+            <w:pPr>
+              <w:spacing w:after="20" w:before="20"/>
+            </w:pPr>
+            <w:r>
+              <w:rPr>
+                <w:rFonts w:ascii="Times New Roman" w:hAnsi="Times New Roman"/>
+                <w:b/>
+                <w:sz w:val="20"/>
+              </w:rPr>
+              <w:t>Married without children</w:t>
+            </w:r>
+          </w:p>
+        </w:tc>
+        <w:tc>
+          <w:tcPr>
+            <w:tcW w:type="dxa" w:w="1440"/>
+          </w:tcPr>
+          <w:p>
+            <w:pPr>
+              <w:spacing w:after="20" w:before="20"/>
+              <w:jc w:val="center"/>
+            </w:pPr>
+            <w:r>
+              <w:rPr>
+                <w:rFonts w:ascii="Times New Roman" w:hAnsi="Times New Roman"/>
+                <w:sz w:val="20"/>
+              </w:rPr>
+              <w:t>121</w:t>
+            </w:r>
+          </w:p>
+        </w:tc>
+        <w:tc>
+          <w:tcPr>
+            <w:tcW w:type="dxa" w:w="1440"/>
+          </w:tcPr>
+          <w:p>
+            <w:pPr>
+              <w:spacing w:after="20" w:before="20"/>
+              <w:jc w:val="center"/>
+            </w:pPr>
+            <w:r>
+              <w:rPr>
+                <w:rFonts w:ascii="Times New Roman" w:hAnsi="Times New Roman"/>
+                <w:sz w:val="20"/>
+              </w:rPr>
+              <w:t>38.78</w:t>
+            </w:r>
+          </w:p>
+        </w:tc>
+        <w:tc>
+          <w:tcPr>
+            <w:tcW w:type="dxa" w:w="1440"/>
+          </w:tcPr>
+          <w:p>
+            <w:pPr>
+              <w:spacing w:after="20" w:before="20"/>
+            </w:pPr>
+            <w:r>
+              <w:rPr>
+                <w:rFonts w:ascii="Times New Roman" w:hAnsi="Times New Roman"/>
+                <w:b/>
+                <w:sz w:val="20"/>
+              </w:rPr>
+              <w:t>Social interaction / content creation</w:t>
+            </w:r>
+          </w:p>
+        </w:tc>
+        <w:tc>
+          <w:tcPr>
+            <w:tcW w:type="dxa" w:w="1440"/>
+          </w:tcPr>
+          <w:p>
+            <w:pPr>
+              <w:spacing w:after="20" w:before="20"/>
+              <w:jc w:val="center"/>
+            </w:pPr>
+            <w:r>
+              <w:rPr>
+                <w:rFonts w:ascii="Times New Roman" w:hAnsi="Times New Roman"/>
+                <w:sz w:val="20"/>
+              </w:rPr>
+            </w:r>
+          </w:p>
+        </w:tc>
+        <w:tc>
+          <w:tcPr>
+            <w:tcW w:type="dxa" w:w="1440"/>
+          </w:tcPr>
+          <w:p>
+            <w:pPr>
+              <w:spacing w:after="20" w:before="20"/>
+              <w:jc w:val="center"/>
+            </w:pPr>
+            <w:r>
+              <w:rPr>
+                <w:rFonts w:ascii="Times New Roman" w:hAnsi="Times New Roman"/>
+                <w:sz w:val="20"/>
+              </w:rPr>
+            </w:r>
+          </w:p>
+        </w:tc>
+      </w:tr>
+      <w:tr>
+        <w:tc>
+          <w:tcPr>
+            <w:tcW w:type="dxa" w:w="1440"/>
+          </w:tcPr>
+          <w:p>
+            <w:pPr>
+              <w:spacing w:after="20" w:before="20"/>
+            </w:pPr>
+            <w:r>
+              <w:rPr>
+                <w:rFonts w:ascii="Times New Roman" w:hAnsi="Times New Roman"/>
+                <w:sz w:val="20"/>
+              </w:rPr>
+            </w:r>
+          </w:p>
+        </w:tc>
+        <w:tc>
+          <w:tcPr>
+            <w:tcW w:type="dxa" w:w="1440"/>
+          </w:tcPr>
+          <w:p>
+            <w:pPr>
+              <w:spacing w:after="20" w:before="20"/>
+              <w:jc w:val="center"/>
+            </w:pPr>
+            <w:r>
+              <w:rPr>
+                <w:rFonts w:ascii="Times New Roman" w:hAnsi="Times New Roman"/>
+                <w:sz w:val="20"/>
+              </w:rPr>
+            </w:r>
+          </w:p>
+        </w:tc>
+        <w:tc>
+          <w:tcPr>
+            <w:tcW w:type="dxa" w:w="1440"/>
+          </w:tcPr>
+          <w:p>
+            <w:pPr>
+              <w:spacing w:after="20" w:before="20"/>
+              <w:jc w:val="center"/>
+            </w:pPr>
+            <w:r>
+              <w:rPr>
+                <w:rFonts w:ascii="Times New Roman" w:hAnsi="Times New Roman"/>
+                <w:sz w:val="20"/>
+              </w:rPr>
+            </w:r>
+          </w:p>
+        </w:tc>
+        <w:tc>
+          <w:tcPr>
+            <w:tcW w:type="dxa" w:w="1440"/>
+          </w:tcPr>
+          <w:p>
+            <w:pPr>
+              <w:spacing w:after="20" w:before="20"/>
+            </w:pPr>
+            <w:r>
+              <w:rPr>
+                <w:rFonts w:ascii="Times New Roman" w:hAnsi="Times New Roman"/>
+                <w:sz w:val="20"/>
+              </w:rPr>
+              <w:t>Yes</w:t>
+            </w:r>
+          </w:p>
+        </w:tc>
+        <w:tc>
+          <w:tcPr>
+            <w:tcW w:type="dxa" w:w="1440"/>
+          </w:tcPr>
+          <w:p>
+            <w:pPr>
+              <w:spacing w:after="20" w:before="20"/>
+              <w:jc w:val="center"/>
+            </w:pPr>
+            <w:r>
+              <w:rPr>
+                <w:rFonts w:ascii="Times New Roman" w:hAnsi="Times New Roman"/>
+                <w:sz w:val="20"/>
+              </w:rPr>
+              <w:t>164</w:t>
+            </w:r>
+          </w:p>
+        </w:tc>
+        <w:tc>
+          <w:tcPr>
+            <w:tcW w:type="dxa" w:w="1440"/>
+          </w:tcPr>
+          <w:p>
+            <w:pPr>
+              <w:spacing w:after="20" w:before="20"/>
+              <w:jc w:val="center"/>
+            </w:pPr>
+            <w:r>
+              <w:rPr>
+                <w:rFonts w:ascii="Times New Roman" w:hAnsi="Times New Roman"/>
+                <w:sz w:val="20"/>
+              </w:rPr>
+              <w:t>52.56</w:t>
+            </w:r>
+          </w:p>
+        </w:tc>
+      </w:tr>
+      <w:tr>
+        <w:tc>
+          <w:tcPr>
+            <w:tcW w:type="dxa" w:w="1440"/>
+          </w:tcPr>
+          <w:p>
+            <w:pPr>
+              <w:spacing w:after="20" w:before="20"/>
+            </w:pPr>
+            <w:r>
+              <w:rPr>
+                <w:rFonts w:ascii="Times New Roman" w:hAnsi="Times New Roman"/>
+                <w:b/>
+                <w:sz w:val="20"/>
+              </w:rPr>
+              <w:t>Occupation</w:t>
+            </w:r>
+          </w:p>
+        </w:tc>
+        <w:tc>
+          <w:tcPr>
+            <w:tcW w:type="dxa" w:w="1440"/>
+          </w:tcPr>
+          <w:p>
+            <w:pPr>
+              <w:spacing w:after="20" w:before="20"/>
+              <w:jc w:val="center"/>
+            </w:pPr>
+            <w:r>
+              <w:rPr>
+                <w:rFonts w:ascii="Times New Roman" w:hAnsi="Times New Roman"/>
+                <w:sz w:val="20"/>
+              </w:rPr>
+            </w:r>
+          </w:p>
+        </w:tc>
+        <w:tc>
+          <w:tcPr>
+            <w:tcW w:type="dxa" w:w="1440"/>
+          </w:tcPr>
+          <w:p>
+            <w:pPr>
+              <w:spacing w:after="20" w:before="20"/>
+              <w:jc w:val="center"/>
+            </w:pPr>
+            <w:r>
+              <w:rPr>
+                <w:rFonts w:ascii="Times New Roman" w:hAnsi="Times New Roman"/>
+                <w:sz w:val="20"/>
+              </w:rPr>
+            </w:r>
+          </w:p>
+        </w:tc>
+        <w:tc>
+          <w:tcPr>
+            <w:tcW w:type="dxa" w:w="1440"/>
+          </w:tcPr>
+          <w:p>
+            <w:pPr>
+              <w:spacing w:after="20" w:before="20"/>
+            </w:pPr>
+            <w:r>
+              <w:rPr>
+                <w:rFonts w:ascii="Times New Roman" w:hAnsi="Times New Roman"/>
+                <w:b/>
+                <w:sz w:val="20"/>
+              </w:rPr>
+              <w:t>No</w:t>
+            </w:r>
+          </w:p>
+        </w:tc>
+        <w:tc>
+          <w:tcPr>
+            <w:tcW w:type="dxa" w:w="1440"/>
+          </w:tcPr>
+          <w:p>
+            <w:pPr>
+              <w:spacing w:after="20" w:before="20"/>
+              <w:jc w:val="center"/>
+            </w:pPr>
+            <w:r>
+              <w:rPr>
+                <w:rFonts w:ascii="Times New Roman" w:hAnsi="Times New Roman"/>
+                <w:sz w:val="20"/>
+              </w:rPr>
+              <w:t>148</w:t>
+            </w:r>
+          </w:p>
+        </w:tc>
+        <w:tc>
+          <w:tcPr>
+            <w:tcW w:type="dxa" w:w="1440"/>
+          </w:tcPr>
+          <w:p>
+            <w:pPr>
+              <w:spacing w:after="20" w:before="20"/>
+              <w:jc w:val="center"/>
+            </w:pPr>
+            <w:r>
+              <w:rPr>
+                <w:rFonts w:ascii="Times New Roman" w:hAnsi="Times New Roman"/>
+                <w:sz w:val="20"/>
+              </w:rPr>
+              <w:t>47.44</w:t>
+            </w:r>
+          </w:p>
+        </w:tc>
+      </w:tr>
+      <w:tr>
+        <w:tc>
+          <w:tcPr>
+            <w:tcW w:type="dxa" w:w="1440"/>
+          </w:tcPr>
+          <w:p>
+            <w:pPr>
+              <w:spacing w:after="20" w:before="20"/>
+            </w:pPr>
+            <w:r>
+              <w:rPr>
+                <w:rFonts w:ascii="Times New Roman" w:hAnsi="Times New Roman"/>
+                <w:b/>
+                <w:sz w:val="20"/>
+              </w:rPr>
+              <w:t>Students</w:t>
+            </w:r>
+          </w:p>
+        </w:tc>
+        <w:tc>
+          <w:tcPr>
+            <w:tcW w:type="dxa" w:w="1440"/>
+          </w:tcPr>
+          <w:p>
+            <w:pPr>
+              <w:spacing w:after="20" w:before="20"/>
+              <w:jc w:val="center"/>
+            </w:pPr>
+            <w:r>
+              <w:rPr>
+                <w:rFonts w:ascii="Times New Roman" w:hAnsi="Times New Roman"/>
+                <w:sz w:val="20"/>
+              </w:rPr>
+              <w:t>88</w:t>
+            </w:r>
+          </w:p>
+        </w:tc>
+        <w:tc>
+          <w:tcPr>
+            <w:tcW w:type="dxa" w:w="1440"/>
+          </w:tcPr>
+          <w:p>
+            <w:pPr>
+              <w:spacing w:after="20" w:before="20"/>
+              <w:jc w:val="center"/>
+            </w:pPr>
+            <w:r>
+              <w:rPr>
+                <w:rFonts w:ascii="Times New Roman" w:hAnsi="Times New Roman"/>
+                <w:sz w:val="20"/>
+              </w:rPr>
+              <w:t>28.21</w:t>
+            </w:r>
+          </w:p>
+        </w:tc>
+        <w:tc>
+          <w:tcPr>
+            <w:tcW w:type="dxa" w:w="1440"/>
+          </w:tcPr>
+          <w:p>
+            <w:pPr>
+              <w:spacing w:after="20" w:before="20"/>
+            </w:pPr>
+            <w:r>
+              <w:rPr>
+                <w:rFonts w:ascii="Times New Roman" w:hAnsi="Times New Roman"/>
+                <w:b/>
+                <w:sz w:val="20"/>
+              </w:rPr>
+              <w:t>Monthly family income</w:t>
+            </w:r>
+          </w:p>
+        </w:tc>
+        <w:tc>
+          <w:tcPr>
+            <w:tcW w:type="dxa" w:w="1440"/>
+          </w:tcPr>
+          <w:p>
+            <w:pPr>
+              <w:spacing w:after="20" w:before="20"/>
+              <w:jc w:val="center"/>
+            </w:pPr>
+            <w:r>
+              <w:rPr>
+                <w:rFonts w:ascii="Times New Roman" w:hAnsi="Times New Roman"/>
+                <w:sz w:val="20"/>
+              </w:rPr>
+            </w:r>
+          </w:p>
+        </w:tc>
+        <w:tc>
+          <w:tcPr>
+            <w:tcW w:type="dxa" w:w="1440"/>
+          </w:tcPr>
+          <w:p>
+            <w:pPr>
+              <w:spacing w:after="20" w:before="20"/>
+              <w:jc w:val="center"/>
+            </w:pPr>
+            <w:r>
+              <w:rPr>
+                <w:rFonts w:ascii="Times New Roman" w:hAnsi="Times New Roman"/>
+                <w:sz w:val="20"/>
+              </w:rPr>
+            </w:r>
+          </w:p>
+        </w:tc>
+      </w:tr>
+      <w:tr>
+        <w:tc>
+          <w:tcPr>
+            <w:tcW w:type="dxa" w:w="1440"/>
+          </w:tcPr>
+          <w:p>
+            <w:pPr>
+              <w:spacing w:after="20" w:before="20"/>
+            </w:pPr>
+            <w:r>
+              <w:rPr>
+                <w:rFonts w:ascii="Times New Roman" w:hAnsi="Times New Roman"/>
+                <w:sz w:val="20"/>
+              </w:rPr>
+              <w:t>Job</w:t>
+            </w:r>
+          </w:p>
+        </w:tc>
+        <w:tc>
+          <w:tcPr>
+            <w:tcW w:type="dxa" w:w="1440"/>
+          </w:tcPr>
+          <w:p>
+            <w:pPr>
+              <w:spacing w:after="20" w:before="20"/>
+              <w:jc w:val="center"/>
+            </w:pPr>
+            <w:r>
+              <w:rPr>
+                <w:rFonts w:ascii="Times New Roman" w:hAnsi="Times New Roman"/>
+                <w:sz w:val="20"/>
+              </w:rPr>
+              <w:t>102</w:t>
+            </w:r>
+          </w:p>
+        </w:tc>
+        <w:tc>
+          <w:tcPr>
+            <w:tcW w:type="dxa" w:w="1440"/>
+          </w:tcPr>
+          <w:p>
+            <w:pPr>
+              <w:spacing w:after="20" w:before="20"/>
+              <w:jc w:val="center"/>
+            </w:pPr>
+            <w:r>
+              <w:rPr>
+                <w:rFonts w:ascii="Times New Roman" w:hAnsi="Times New Roman"/>
+                <w:sz w:val="20"/>
+              </w:rPr>
+              <w:t>32.69</w:t>
+            </w:r>
+          </w:p>
+        </w:tc>
+        <w:tc>
+          <w:tcPr>
+            <w:tcW w:type="dxa" w:w="1440"/>
+          </w:tcPr>
+          <w:p>
+            <w:pPr>
+              <w:spacing w:after="20" w:before="20"/>
+            </w:pPr>
+            <w:r>
+              <w:rPr>
+                <w:rFonts w:ascii="Times New Roman" w:hAnsi="Times New Roman"/>
+                <w:sz w:val="20"/>
+              </w:rPr>
+              <w:t>INR 30,000 or less</w:t>
+            </w:r>
+          </w:p>
+        </w:tc>
+        <w:tc>
+          <w:tcPr>
+            <w:tcW w:type="dxa" w:w="1440"/>
+          </w:tcPr>
+          <w:p>
+            <w:pPr>
+              <w:spacing w:after="20" w:before="20"/>
+              <w:jc w:val="center"/>
+            </w:pPr>
+            <w:r>
+              <w:rPr>
+                <w:rFonts w:ascii="Times New Roman" w:hAnsi="Times New Roman"/>
+                <w:sz w:val="20"/>
+              </w:rPr>
+              <w:t>57</w:t>
+            </w:r>
+          </w:p>
+        </w:tc>
+        <w:tc>
+          <w:tcPr>
+            <w:tcW w:type="dxa" w:w="1440"/>
+          </w:tcPr>
+          <w:p>
+            <w:pPr>
+              <w:spacing w:after="20" w:before="20"/>
+              <w:jc w:val="center"/>
+            </w:pPr>
+            <w:r>
+              <w:rPr>
+                <w:rFonts w:ascii="Times New Roman" w:hAnsi="Times New Roman"/>
+                <w:sz w:val="20"/>
+              </w:rPr>
+              <w:t>18.40</w:t>
+            </w:r>
+          </w:p>
+        </w:tc>
+      </w:tr>
+      <w:tr>
+        <w:tc>
+          <w:tcPr>
+            <w:tcW w:type="dxa" w:w="1440"/>
+          </w:tcPr>
+          <w:p>
+            <w:pPr>
+              <w:spacing w:after="20" w:before="20"/>
+            </w:pPr>
+            <w:r>
+              <w:rPr>
+                <w:rFonts w:ascii="Times New Roman" w:hAnsi="Times New Roman"/>
+                <w:sz w:val="20"/>
+              </w:rPr>
+              <w:t>Business</w:t>
+            </w:r>
+          </w:p>
+        </w:tc>
+        <w:tc>
+          <w:tcPr>
+            <w:tcW w:type="dxa" w:w="1440"/>
+          </w:tcPr>
+          <w:p>
+            <w:pPr>
+              <w:spacing w:after="20" w:before="20"/>
+              <w:jc w:val="center"/>
+            </w:pPr>
+            <w:r>
+              <w:rPr>
+                <w:rFonts w:ascii="Times New Roman" w:hAnsi="Times New Roman"/>
+                <w:sz w:val="20"/>
+              </w:rPr>
+              <w:t>122</w:t>
+            </w:r>
+          </w:p>
+        </w:tc>
+        <w:tc>
+          <w:tcPr>
+            <w:tcW w:type="dxa" w:w="1440"/>
+          </w:tcPr>
+          <w:p>
+            <w:pPr>
+              <w:spacing w:after="20" w:before="20"/>
+              <w:jc w:val="center"/>
+            </w:pPr>
+            <w:r>
+              <w:rPr>
+                <w:rFonts w:ascii="Times New Roman" w:hAnsi="Times New Roman"/>
+                <w:sz w:val="20"/>
+              </w:rPr>
+              <w:t>39.10</w:t>
+            </w:r>
+          </w:p>
+        </w:tc>
+        <w:tc>
+          <w:tcPr>
+            <w:tcW w:type="dxa" w:w="1440"/>
+          </w:tcPr>
+          <w:p>
+            <w:pPr>
+              <w:spacing w:after="20" w:before="20"/>
+            </w:pPr>
+            <w:r>
+              <w:rPr>
+                <w:rFonts w:ascii="Times New Roman" w:hAnsi="Times New Roman"/>
+                <w:sz w:val="20"/>
+              </w:rPr>
+              <w:t>INR 30,001–50,000</w:t>
+            </w:r>
+          </w:p>
+        </w:tc>
+        <w:tc>
+          <w:tcPr>
+            <w:tcW w:type="dxa" w:w="1440"/>
+          </w:tcPr>
+          <w:p>
+            <w:pPr>
+              <w:spacing w:after="20" w:before="20"/>
+              <w:jc w:val="center"/>
+            </w:pPr>
+            <w:r>
+              <w:rPr>
+                <w:rFonts w:ascii="Times New Roman" w:hAnsi="Times New Roman"/>
+                <w:sz w:val="20"/>
+              </w:rPr>
+              <w:t>80</w:t>
+            </w:r>
+          </w:p>
+        </w:tc>
+        <w:tc>
+          <w:tcPr>
+            <w:tcW w:type="dxa" w:w="1440"/>
+          </w:tcPr>
+          <w:p>
+            <w:pPr>
+              <w:spacing w:after="20" w:before="20"/>
+              <w:jc w:val="center"/>
+            </w:pPr>
+            <w:r>
+              <w:rPr>
+                <w:rFonts w:ascii="Times New Roman" w:hAnsi="Times New Roman"/>
+                <w:sz w:val="20"/>
+              </w:rPr>
+              <w:t>25.64</w:t>
+            </w:r>
+          </w:p>
+        </w:tc>
+      </w:tr>
+      <w:tr>
+        <w:tc>
+          <w:tcPr>
+            <w:tcW w:type="dxa" w:w="1440"/>
+          </w:tcPr>
+          <w:p>
+            <w:pPr>
+              <w:spacing w:after="20" w:before="20"/>
+            </w:pPr>
+            <w:r>
+              <w:rPr>
+                <w:rFonts w:ascii="Times New Roman" w:hAnsi="Times New Roman"/>
+                <w:sz w:val="20"/>
+              </w:rPr>
+            </w:r>
+          </w:p>
+        </w:tc>
+        <w:tc>
+          <w:tcPr>
+            <w:tcW w:type="dxa" w:w="1440"/>
+          </w:tcPr>
+          <w:p>
+            <w:pPr>
+              <w:spacing w:after="20" w:before="20"/>
+              <w:jc w:val="center"/>
+            </w:pPr>
+            <w:r>
+              <w:rPr>
+                <w:rFonts w:ascii="Times New Roman" w:hAnsi="Times New Roman"/>
+                <w:sz w:val="20"/>
+              </w:rPr>
+            </w:r>
+          </w:p>
+        </w:tc>
+        <w:tc>
+          <w:tcPr>
+            <w:tcW w:type="dxa" w:w="1440"/>
+          </w:tcPr>
+          <w:p>
+            <w:pPr>
+              <w:spacing w:after="20" w:before="20"/>
+              <w:jc w:val="center"/>
+            </w:pPr>
+            <w:r>
+              <w:rPr>
+                <w:rFonts w:ascii="Times New Roman" w:hAnsi="Times New Roman"/>
+                <w:sz w:val="20"/>
+              </w:rPr>
+            </w:r>
+          </w:p>
+        </w:tc>
+        <w:tc>
+          <w:tcPr>
+            <w:tcW w:type="dxa" w:w="1440"/>
+          </w:tcPr>
+          <w:p>
+            <w:pPr>
+              <w:spacing w:after="20" w:before="20"/>
+            </w:pPr>
+            <w:r>
+              <w:rPr>
+                <w:rFonts w:ascii="Times New Roman" w:hAnsi="Times New Roman"/>
+                <w:sz w:val="20"/>
+              </w:rPr>
+              <w:t>INR 50,001–80,000</w:t>
+            </w:r>
+          </w:p>
+        </w:tc>
+        <w:tc>
+          <w:tcPr>
+            <w:tcW w:type="dxa" w:w="1440"/>
+          </w:tcPr>
+          <w:p>
+            <w:pPr>
+              <w:spacing w:after="20" w:before="20"/>
+              <w:jc w:val="center"/>
+            </w:pPr>
+            <w:r>
+              <w:rPr>
+                <w:rFonts w:ascii="Times New Roman" w:hAnsi="Times New Roman"/>
+                <w:sz w:val="20"/>
+              </w:rPr>
+              <w:t>100</w:t>
+            </w:r>
+          </w:p>
+        </w:tc>
+        <w:tc>
+          <w:tcPr>
+            <w:tcW w:type="dxa" w:w="1440"/>
+          </w:tcPr>
+          <w:p>
+            <w:pPr>
+              <w:spacing w:after="20" w:before="20"/>
+              <w:jc w:val="center"/>
+            </w:pPr>
+            <w:r>
+              <w:rPr>
+                <w:rFonts w:ascii="Times New Roman" w:hAnsi="Times New Roman"/>
+                <w:sz w:val="20"/>
+              </w:rPr>
+              <w:t>32.05</w:t>
+            </w:r>
+          </w:p>
+        </w:tc>
+      </w:tr>
+      <w:tr>
+        <w:tc>
+          <w:tcPr>
+            <w:tcW w:type="dxa" w:w="1440"/>
+          </w:tcPr>
+          <w:p>
+            <w:pPr>
+              <w:spacing w:after="20" w:before="20"/>
+            </w:pPr>
+            <w:r>
+              <w:rPr>
+                <w:rFonts w:ascii="Times New Roman" w:hAnsi="Times New Roman"/>
+                <w:sz w:val="20"/>
+              </w:rPr>
+            </w:r>
+          </w:p>
+        </w:tc>
+        <w:tc>
+          <w:tcPr>
+            <w:tcW w:type="dxa" w:w="1440"/>
+          </w:tcPr>
+          <w:p>
+            <w:pPr>
+              <w:spacing w:after="20" w:before="20"/>
+              <w:jc w:val="center"/>
+            </w:pPr>
+            <w:r>
+              <w:rPr>
+                <w:rFonts w:ascii="Times New Roman" w:hAnsi="Times New Roman"/>
+                <w:sz w:val="20"/>
+              </w:rPr>
+            </w:r>
+          </w:p>
+        </w:tc>
+        <w:tc>
+          <w:tcPr>
+            <w:tcW w:type="dxa" w:w="1440"/>
+          </w:tcPr>
+          <w:p>
+            <w:pPr>
+              <w:spacing w:after="20" w:before="20"/>
+              <w:jc w:val="center"/>
+            </w:pPr>
+            <w:r>
+              <w:rPr>
+                <w:rFonts w:ascii="Times New Roman" w:hAnsi="Times New Roman"/>
+                <w:sz w:val="20"/>
+              </w:rPr>
+            </w:r>
+          </w:p>
+        </w:tc>
+        <w:tc>
+          <w:tcPr>
+            <w:tcW w:type="dxa" w:w="1440"/>
+          </w:tcPr>
+          <w:p>
+            <w:pPr>
+              <w:spacing w:after="20" w:before="20"/>
+            </w:pPr>
+            <w:r>
+              <w:rPr>
+                <w:rFonts w:ascii="Times New Roman" w:hAnsi="Times New Roman"/>
+                <w:sz w:val="20"/>
+              </w:rPr>
+              <w:t>INR 80,001 and above</w:t>
+            </w:r>
+          </w:p>
+        </w:tc>
+        <w:tc>
+          <w:tcPr>
+            <w:tcW w:type="dxa" w:w="1440"/>
+          </w:tcPr>
+          <w:p>
+            <w:pPr>
+              <w:spacing w:after="20" w:before="20"/>
+              <w:jc w:val="center"/>
+            </w:pPr>
+            <w:r>
+              <w:rPr>
+                <w:rFonts w:ascii="Times New Roman" w:hAnsi="Times New Roman"/>
+                <w:sz w:val="20"/>
+              </w:rPr>
+              <w:t>75</w:t>
+            </w:r>
+          </w:p>
+        </w:tc>
+        <w:tc>
+          <w:tcPr>
+            <w:tcW w:type="dxa" w:w="1440"/>
+          </w:tcPr>
+          <w:p>
+            <w:pPr>
+              <w:spacing w:after="20" w:before="20"/>
+              <w:jc w:val="center"/>
+            </w:pPr>
+            <w:r>
+              <w:rPr>
+                <w:rFonts w:ascii="Times New Roman" w:hAnsi="Times New Roman"/>
+                <w:sz w:val="20"/>
+              </w:rPr>
+              <w:t>23.91</w:t>
+            </w:r>
+          </w:p>
+        </w:tc>
+      </w:tr>
+    </w:tbl>
+    <w:p>
+      <w:pPr>
+        <w:spacing w:after="120"/>
+      </w:pPr>
     </w:p>
     <w:p>
       <w:pPr>

</xml_diff>